<commit_message>
feat(form): add bilingual FR/AR double-entry support and separate template data
</commit_message>
<xml_diff>
--- a/backend/templates/MODEL ENTREPRISE AR.docx
+++ b/backend/templates/MODEL ENTREPRISE AR.docx
@@ -273,6 +273,12 @@
         </w:rPr>
         <w:t>raison_sociale</w:t>
       </w:r>
+      <w:r>
+        <w:rPr>
+          <w:rFonts w:asciiTheme="minorBidi" w:hAnsiTheme="minorBidi"/>
+        </w:rPr>
+        <w:t>_ar</w:t>
+      </w:r>
       <w:proofErr w:type="spellEnd"/>
       <w:r>
         <w:rPr>
@@ -343,6 +349,14 @@
           <w:szCs w:val="28"/>
         </w:rPr>
         <w:t>_entreprise</w:t>
+      </w:r>
+      <w:r>
+        <w:rPr>
+          <w:rFonts w:asciiTheme="majorHAnsi" w:hAnsiTheme="majorHAnsi"/>
+          <w:sz w:val="24"/>
+          <w:szCs w:val="28"/>
+        </w:rPr>
+        <w:t>_ar</w:t>
       </w:r>
       <w:proofErr w:type="spellEnd"/>
       <w:r>
@@ -715,6 +729,13 @@
           <w:sz w:val="20"/>
         </w:rPr>
         <w:t>authority_gerant</w:t>
+      </w:r>
+      <w:r>
+        <w:rPr>
+          <w:rFonts w:asciiTheme="majorHAnsi" w:hAnsiTheme="majorHAnsi"/>
+          <w:sz w:val="20"/>
+        </w:rPr>
+        <w:t>_ar</w:t>
       </w:r>
       <w:proofErr w:type="spellEnd"/>
       <w:r>
@@ -1770,12 +1791,32 @@
         </w:rPr>
         <w:t>{</w:t>
       </w:r>
+      <w:proofErr w:type="spellStart"/>
+      <w:r>
+        <w:rPr>
+          <w:rFonts w:asciiTheme="minorBidi" w:hAnsiTheme="minorBidi"/>
+        </w:rPr>
+        <w:t>place</w:t>
+      </w:r>
+      <w:r>
+        <w:rPr>
+          <w:rFonts w:asciiTheme="minorBidi" w:hAnsiTheme="minorBidi"/>
+        </w:rPr>
+        <w:t>_</w:t>
+      </w:r>
       <w:proofErr w:type="gramStart"/>
       <w:r>
         <w:rPr>
           <w:rFonts w:asciiTheme="minorBidi" w:hAnsiTheme="minorBidi"/>
         </w:rPr>
-        <w:t xml:space="preserve">place}  </w:t>
+        <w:t>ar</w:t>
+      </w:r>
+      <w:proofErr w:type="spellEnd"/>
+      <w:r>
+        <w:rPr>
+          <w:rFonts w:asciiTheme="minorBidi" w:hAnsiTheme="minorBidi"/>
+        </w:rPr>
+        <w:t xml:space="preserve">}  </w:t>
       </w:r>
       <w:r>
         <w:rPr>
@@ -1817,14 +1858,40 @@
         <w:rPr>
           <w:rFonts w:asciiTheme="minorBidi" w:hAnsiTheme="minorBidi"/>
         </w:rPr>
-        <w:t>{Nom} {</w:t>
+        <w:t>{</w:t>
       </w:r>
       <w:proofErr w:type="spellStart"/>
       <w:r>
         <w:rPr>
           <w:rFonts w:asciiTheme="minorBidi" w:hAnsiTheme="minorBidi"/>
         </w:rPr>
+        <w:t>Nom</w:t>
+      </w:r>
+      <w:r>
+        <w:rPr>
+          <w:rFonts w:asciiTheme="minorBidi" w:hAnsiTheme="minorBidi"/>
+        </w:rPr>
+        <w:t>_ar</w:t>
+      </w:r>
+      <w:proofErr w:type="spellEnd"/>
+      <w:r>
+        <w:rPr>
+          <w:rFonts w:asciiTheme="minorBidi" w:hAnsiTheme="minorBidi"/>
+        </w:rPr>
+        <w:t>} {</w:t>
+      </w:r>
+      <w:proofErr w:type="spellStart"/>
+      <w:r>
+        <w:rPr>
+          <w:rFonts w:asciiTheme="minorBidi" w:hAnsiTheme="minorBidi"/>
+        </w:rPr>
         <w:t>Prenom</w:t>
+      </w:r>
+      <w:r>
+        <w:rPr>
+          <w:rFonts w:asciiTheme="minorBidi" w:hAnsiTheme="minorBidi"/>
+        </w:rPr>
+        <w:t>_ar</w:t>
       </w:r>
       <w:proofErr w:type="spellEnd"/>
       <w:r>
@@ -9543,7 +9610,7 @@
           <w:szCs w:val="20"/>
           <w:lang w:val="en-US"/>
         </w:rPr>
-        <w:t>{Nom} {</w:t>
+        <w:t>{</w:t>
       </w:r>
       <w:proofErr w:type="spellStart"/>
       <w:r>
@@ -9553,8 +9620,46 @@
           <w:szCs w:val="20"/>
           <w:lang w:val="en-US"/>
         </w:rPr>
+        <w:t>Nom</w:t>
+      </w:r>
+      <w:r>
+        <w:rPr>
+          <w:rFonts w:asciiTheme="minorBidi" w:hAnsiTheme="minorBidi"/>
+          <w:sz w:val="20"/>
+          <w:szCs w:val="20"/>
+          <w:lang w:val="en-US"/>
+        </w:rPr>
+        <w:t>_ar</w:t>
+      </w:r>
+      <w:proofErr w:type="spellEnd"/>
+      <w:r>
+        <w:rPr>
+          <w:rFonts w:asciiTheme="minorBidi" w:hAnsiTheme="minorBidi"/>
+          <w:sz w:val="20"/>
+          <w:szCs w:val="20"/>
+          <w:lang w:val="en-US"/>
+        </w:rPr>
+        <w:t>} {</w:t>
+      </w:r>
+      <w:proofErr w:type="spellStart"/>
+      <w:r>
+        <w:rPr>
+          <w:rFonts w:asciiTheme="minorBidi" w:hAnsiTheme="minorBidi"/>
+          <w:sz w:val="20"/>
+          <w:szCs w:val="20"/>
+          <w:lang w:val="en-US"/>
+        </w:rPr>
         <w:t>Prenom</w:t>
       </w:r>
+      <w:r>
+        <w:rPr>
+          <w:rFonts w:asciiTheme="minorBidi" w:hAnsiTheme="minorBidi"/>
+          <w:sz w:val="20"/>
+          <w:szCs w:val="20"/>
+          <w:lang w:val="en-US"/>
+        </w:rPr>
+        <w:t>_ar</w:t>
+      </w:r>
       <w:proofErr w:type="spellEnd"/>
       <w:r>
         <w:rPr>
@@ -9644,7 +9749,36 @@
           <w:szCs w:val="20"/>
           <w:lang w:val="en-US"/>
         </w:rPr>
-        <w:t>{place}</w:t>
+        <w:t>{</w:t>
+      </w:r>
+      <w:proofErr w:type="spellStart"/>
+      <w:r>
+        <w:rPr>
+          <w:rFonts w:asciiTheme="minorBidi" w:hAnsiTheme="minorBidi"/>
+          <w:sz w:val="20"/>
+          <w:szCs w:val="20"/>
+          <w:lang w:val="en-US"/>
+        </w:rPr>
+        <w:t>place</w:t>
+      </w:r>
+      <w:r>
+        <w:rPr>
+          <w:rFonts w:asciiTheme="minorBidi" w:hAnsiTheme="minorBidi"/>
+          <w:sz w:val="20"/>
+          <w:szCs w:val="20"/>
+          <w:lang w:val="en-US"/>
+        </w:rPr>
+        <w:t>_ar</w:t>
+      </w:r>
+      <w:proofErr w:type="spellEnd"/>
+      <w:r>
+        <w:rPr>
+          <w:rFonts w:asciiTheme="minorBidi" w:hAnsiTheme="minorBidi"/>
+          <w:sz w:val="20"/>
+          <w:szCs w:val="20"/>
+          <w:lang w:val="en-US"/>
+        </w:rPr>
+        <w:t>}</w:t>
       </w:r>
     </w:p>
     <w:p>
@@ -10103,7 +10237,36 @@
           <w:sz w:val="24"/>
           <w:szCs w:val="28"/>
         </w:rPr>
-        <w:t>{place}</w:t>
+        <w:t>{</w:t>
+      </w:r>
+      <w:proofErr w:type="spellStart"/>
+      <w:r>
+        <w:rPr>
+          <w:rFonts w:asciiTheme="minorBidi" w:hAnsiTheme="minorBidi"/>
+          <w:bCs/>
+          <w:sz w:val="24"/>
+          <w:szCs w:val="28"/>
+        </w:rPr>
+        <w:t>place</w:t>
+      </w:r>
+      <w:r>
+        <w:rPr>
+          <w:rFonts w:asciiTheme="minorBidi" w:hAnsiTheme="minorBidi"/>
+          <w:bCs/>
+          <w:sz w:val="24"/>
+          <w:szCs w:val="28"/>
+        </w:rPr>
+        <w:t>_ar</w:t>
+      </w:r>
+      <w:proofErr w:type="spellEnd"/>
+      <w:r>
+        <w:rPr>
+          <w:rFonts w:asciiTheme="minorBidi" w:hAnsiTheme="minorBidi"/>
+          <w:bCs/>
+          <w:sz w:val="24"/>
+          <w:szCs w:val="28"/>
+        </w:rPr>
+        <w:t>}</w:t>
       </w:r>
       <w:r>
         <w:rPr>
@@ -10243,12 +10406,26 @@
         </w:rPr>
         <w:t xml:space="preserve"> {</w:t>
       </w:r>
+      <w:proofErr w:type="spellStart"/>
       <w:proofErr w:type="gramEnd"/>
       <w:r>
         <w:rPr>
           <w:rFonts w:asciiTheme="minorBidi" w:hAnsiTheme="minorBidi"/>
         </w:rPr>
-        <w:t>Nom} {</w:t>
+        <w:t>Nom</w:t>
+      </w:r>
+      <w:r>
+        <w:rPr>
+          <w:rFonts w:asciiTheme="minorBidi" w:hAnsiTheme="minorBidi"/>
+        </w:rPr>
+        <w:t>_ar</w:t>
+      </w:r>
+      <w:proofErr w:type="spellEnd"/>
+      <w:r>
+        <w:rPr>
+          <w:rFonts w:asciiTheme="minorBidi" w:hAnsiTheme="minorBidi"/>
+        </w:rPr>
+        <w:t>} {</w:t>
       </w:r>
       <w:proofErr w:type="spellStart"/>
       <w:r>
@@ -10256,6 +10433,12 @@
           <w:rFonts w:asciiTheme="minorBidi" w:hAnsiTheme="minorBidi"/>
         </w:rPr>
         <w:t>Prenom</w:t>
+      </w:r>
+      <w:r>
+        <w:rPr>
+          <w:rFonts w:asciiTheme="minorBidi" w:hAnsiTheme="minorBidi"/>
+        </w:rPr>
+        <w:t>_ar</w:t>
       </w:r>
       <w:proofErr w:type="spellEnd"/>
       <w:r>
@@ -10301,6 +10484,12 @@
         </w:rPr>
         <w:t>raison_sociale</w:t>
       </w:r>
+      <w:r>
+        <w:rPr>
+          <w:rFonts w:asciiTheme="minorBidi" w:hAnsiTheme="minorBidi"/>
+        </w:rPr>
+        <w:t>_ar</w:t>
+      </w:r>
       <w:proofErr w:type="spellEnd"/>
       <w:r>
         <w:rPr>
@@ -10339,6 +10528,12 @@
           <w:rFonts w:asciiTheme="minorBidi" w:hAnsiTheme="minorBidi"/>
         </w:rPr>
         <w:t>Adresse_entreprise</w:t>
+      </w:r>
+      <w:r>
+        <w:rPr>
+          <w:rFonts w:asciiTheme="minorBidi" w:hAnsiTheme="minorBidi"/>
+        </w:rPr>
+        <w:t>_ar</w:t>
       </w:r>
       <w:proofErr w:type="spellEnd"/>
       <w:r>
@@ -10855,14 +11050,40 @@
           <w:rFonts w:asciiTheme="minorBidi" w:hAnsiTheme="minorBidi"/>
         </w:rPr>
         <w:br/>
-        <w:t>{Nom} {</w:t>
+        <w:t>{</w:t>
       </w:r>
       <w:proofErr w:type="spellStart"/>
       <w:r>
         <w:rPr>
           <w:rFonts w:asciiTheme="minorBidi" w:hAnsiTheme="minorBidi"/>
         </w:rPr>
+        <w:t>Nom</w:t>
+      </w:r>
+      <w:r>
+        <w:rPr>
+          <w:rFonts w:asciiTheme="minorBidi" w:hAnsiTheme="minorBidi"/>
+        </w:rPr>
+        <w:t>_ar</w:t>
+      </w:r>
+      <w:proofErr w:type="spellEnd"/>
+      <w:r>
+        <w:rPr>
+          <w:rFonts w:asciiTheme="minorBidi" w:hAnsiTheme="minorBidi"/>
+        </w:rPr>
+        <w:t>} {</w:t>
+      </w:r>
+      <w:proofErr w:type="spellStart"/>
+      <w:r>
+        <w:rPr>
+          <w:rFonts w:asciiTheme="minorBidi" w:hAnsiTheme="minorBidi"/>
+        </w:rPr>
         <w:t>Prenom</w:t>
+      </w:r>
+      <w:r>
+        <w:rPr>
+          <w:rFonts w:asciiTheme="minorBidi" w:hAnsiTheme="minorBidi"/>
+        </w:rPr>
+        <w:t>_ar</w:t>
       </w:r>
       <w:proofErr w:type="spellEnd"/>
       <w:r>
@@ -11283,7 +11504,36 @@
           <w:sz w:val="24"/>
           <w:szCs w:val="28"/>
         </w:rPr>
-        <w:t>{place}</w:t>
+        <w:t>{</w:t>
+      </w:r>
+      <w:proofErr w:type="spellStart"/>
+      <w:r>
+        <w:rPr>
+          <w:rFonts w:asciiTheme="minorBidi" w:hAnsiTheme="minorBidi"/>
+          <w:bCs/>
+          <w:sz w:val="24"/>
+          <w:szCs w:val="28"/>
+        </w:rPr>
+        <w:t>place</w:t>
+      </w:r>
+      <w:r>
+        <w:rPr>
+          <w:rFonts w:asciiTheme="minorBidi" w:hAnsiTheme="minorBidi"/>
+          <w:bCs/>
+          <w:sz w:val="24"/>
+          <w:szCs w:val="28"/>
+        </w:rPr>
+        <w:t>_ar</w:t>
+      </w:r>
+      <w:proofErr w:type="spellEnd"/>
+      <w:r>
+        <w:rPr>
+          <w:rFonts w:asciiTheme="minorBidi" w:hAnsiTheme="minorBidi"/>
+          <w:bCs/>
+          <w:sz w:val="24"/>
+          <w:szCs w:val="28"/>
+        </w:rPr>
+        <w:t>}</w:t>
       </w:r>
       <w:r>
         <w:rPr>
@@ -11432,15 +11682,41 @@
         <w:rPr>
           <w:rFonts w:asciiTheme="minorBidi" w:hAnsiTheme="minorBidi" w:cstheme="minorBidi"/>
         </w:rPr>
-        <w:t>{Nom} {</w:t>
+        <w:t>{</w:t>
       </w:r>
       <w:proofErr w:type="spellStart"/>
       <w:r>
         <w:rPr>
           <w:rFonts w:asciiTheme="minorBidi" w:hAnsiTheme="minorBidi" w:cstheme="minorBidi"/>
         </w:rPr>
+        <w:t>Nom</w:t>
+      </w:r>
+      <w:r>
+        <w:rPr>
+          <w:rFonts w:asciiTheme="minorBidi" w:hAnsiTheme="minorBidi" w:cstheme="minorBidi"/>
+        </w:rPr>
+        <w:t>_ar</w:t>
+      </w:r>
+      <w:proofErr w:type="spellEnd"/>
+      <w:r>
+        <w:rPr>
+          <w:rFonts w:asciiTheme="minorBidi" w:hAnsiTheme="minorBidi" w:cstheme="minorBidi"/>
+        </w:rPr>
+        <w:t>} {</w:t>
+      </w:r>
+      <w:proofErr w:type="spellStart"/>
+      <w:r>
+        <w:rPr>
+          <w:rFonts w:asciiTheme="minorBidi" w:hAnsiTheme="minorBidi" w:cstheme="minorBidi"/>
+        </w:rPr>
         <w:t>Prenom</w:t>
       </w:r>
+      <w:r>
+        <w:rPr>
+          <w:rFonts w:asciiTheme="minorBidi" w:hAnsiTheme="minorBidi" w:cstheme="minorBidi"/>
+        </w:rPr>
+        <w:t>_ar</w:t>
+      </w:r>
       <w:proofErr w:type="spellEnd"/>
       <w:r>
         <w:rPr>
@@ -11551,19 +11827,40 @@
         <w:rPr>
           <w:rFonts w:asciiTheme="minorBidi" w:hAnsiTheme="minorBidi" w:cstheme="minorBidi"/>
         </w:rPr>
-        <w:t xml:space="preserve"> AIRBAND</w:t>
-      </w:r>
+        <w:t xml:space="preserve"> </w:t>
+      </w:r>
+      <w:proofErr w:type="gramStart"/>
       <w:r>
         <w:rPr>
           <w:rFonts w:asciiTheme="minorBidi" w:hAnsiTheme="minorBidi" w:cstheme="minorBidi"/>
-          <w:rtl/>
-        </w:rPr>
-        <w:t>، وذلك حصرياً لأغراض التركيب أو الصيانة أو نزع التجهيزات أو البنى التحتية التابعة لها</w:t>
+        </w:rPr>
+        <w:t>AIRBAND</w:t>
       </w:r>
       <w:r>
         <w:rPr>
           <w:rFonts w:asciiTheme="minorBidi" w:hAnsiTheme="minorBidi" w:cstheme="minorBidi"/>
         </w:rPr>
+        <w:t xml:space="preserve"> </w:t>
+      </w:r>
+      <w:r>
+        <w:rPr>
+          <w:rFonts w:asciiTheme="minorBidi" w:hAnsiTheme="minorBidi" w:cstheme="minorBidi"/>
+          <w:rtl/>
+        </w:rPr>
+        <w:t>،</w:t>
+      </w:r>
+      <w:proofErr w:type="gramEnd"/>
+      <w:r>
+        <w:rPr>
+          <w:rFonts w:asciiTheme="minorBidi" w:hAnsiTheme="minorBidi" w:cstheme="minorBidi"/>
+          <w:rtl/>
+        </w:rPr>
+        <w:t xml:space="preserve"> وذلك حصرياً لأغراض التركيب أو الصيانة أو نزع التجهيزات أو البنى التحتية التابعة لها</w:t>
+      </w:r>
+      <w:r>
+        <w:rPr>
+          <w:rFonts w:asciiTheme="minorBidi" w:hAnsiTheme="minorBidi" w:cstheme="minorBidi"/>
+        </w:rPr>
         <w:t>.</w:t>
       </w:r>
     </w:p>
@@ -11638,15 +11935,41 @@
         <w:rPr>
           <w:rFonts w:asciiTheme="minorBidi" w:hAnsiTheme="minorBidi" w:cstheme="minorBidi"/>
         </w:rPr>
-        <w:t>{Nom} {</w:t>
+        <w:t>{</w:t>
       </w:r>
       <w:proofErr w:type="spellStart"/>
       <w:r>
         <w:rPr>
           <w:rFonts w:asciiTheme="minorBidi" w:hAnsiTheme="minorBidi" w:cstheme="minorBidi"/>
         </w:rPr>
+        <w:t>Nom</w:t>
+      </w:r>
+      <w:r>
+        <w:rPr>
+          <w:rFonts w:asciiTheme="minorBidi" w:hAnsiTheme="minorBidi" w:cstheme="minorBidi"/>
+        </w:rPr>
+        <w:t>_ar</w:t>
+      </w:r>
+      <w:proofErr w:type="spellEnd"/>
+      <w:r>
+        <w:rPr>
+          <w:rFonts w:asciiTheme="minorBidi" w:hAnsiTheme="minorBidi" w:cstheme="minorBidi"/>
+        </w:rPr>
+        <w:t>} {</w:t>
+      </w:r>
+      <w:proofErr w:type="spellStart"/>
+      <w:r>
+        <w:rPr>
+          <w:rFonts w:asciiTheme="minorBidi" w:hAnsiTheme="minorBidi" w:cstheme="minorBidi"/>
+        </w:rPr>
         <w:t>Prenom</w:t>
       </w:r>
+      <w:r>
+        <w:rPr>
+          <w:rFonts w:asciiTheme="minorBidi" w:hAnsiTheme="minorBidi" w:cstheme="minorBidi"/>
+        </w:rPr>
+        <w:t>_ar</w:t>
+      </w:r>
       <w:proofErr w:type="spellEnd"/>
       <w:r>
         <w:rPr>
@@ -11794,6 +12117,12 @@
           <w:rFonts w:asciiTheme="minorBidi" w:hAnsiTheme="minorBidi" w:cstheme="minorBidi"/>
         </w:rPr>
         <w:t>authority_gerant</w:t>
+      </w:r>
+      <w:r>
+        <w:rPr>
+          <w:rFonts w:asciiTheme="minorBidi" w:hAnsiTheme="minorBidi" w:cstheme="minorBidi"/>
+        </w:rPr>
+        <w:t>_ar</w:t>
       </w:r>
       <w:proofErr w:type="spellEnd"/>
       <w:r>
@@ -12281,15 +12610,6 @@
         </w:rPr>
         <w:t>{</w:t>
       </w:r>
-      <w:r>
-        <w:rPr>
-          <w:rFonts w:asciiTheme="minorBidi" w:eastAsia="Times New Roman" w:hAnsiTheme="minorBidi"/>
-          <w:sz w:val="24"/>
-          <w:szCs w:val="24"/>
-          <w:lang w:eastAsia="fr-FR"/>
-        </w:rPr>
-        <w:t>Nom} {</w:t>
-      </w:r>
       <w:proofErr w:type="spellStart"/>
       <w:r>
         <w:rPr>
@@ -12298,8 +12618,46 @@
           <w:szCs w:val="24"/>
           <w:lang w:eastAsia="fr-FR"/>
         </w:rPr>
+        <w:t>Nom</w:t>
+      </w:r>
+      <w:r>
+        <w:rPr>
+          <w:rFonts w:asciiTheme="minorBidi" w:eastAsia="Times New Roman" w:hAnsiTheme="minorBidi"/>
+          <w:sz w:val="24"/>
+          <w:szCs w:val="24"/>
+          <w:lang w:eastAsia="fr-FR"/>
+        </w:rPr>
+        <w:t>_ar</w:t>
+      </w:r>
+      <w:proofErr w:type="spellEnd"/>
+      <w:r>
+        <w:rPr>
+          <w:rFonts w:asciiTheme="minorBidi" w:eastAsia="Times New Roman" w:hAnsiTheme="minorBidi"/>
+          <w:sz w:val="24"/>
+          <w:szCs w:val="24"/>
+          <w:lang w:eastAsia="fr-FR"/>
+        </w:rPr>
+        <w:t>} {</w:t>
+      </w:r>
+      <w:proofErr w:type="spellStart"/>
+      <w:r>
+        <w:rPr>
+          <w:rFonts w:asciiTheme="minorBidi" w:eastAsia="Times New Roman" w:hAnsiTheme="minorBidi"/>
+          <w:sz w:val="24"/>
+          <w:szCs w:val="24"/>
+          <w:lang w:eastAsia="fr-FR"/>
+        </w:rPr>
         <w:t>Prenom</w:t>
       </w:r>
+      <w:r>
+        <w:rPr>
+          <w:rFonts w:asciiTheme="minorBidi" w:eastAsia="Times New Roman" w:hAnsiTheme="minorBidi"/>
+          <w:sz w:val="24"/>
+          <w:szCs w:val="24"/>
+          <w:lang w:eastAsia="fr-FR"/>
+        </w:rPr>
+        <w:t>_ar</w:t>
+      </w:r>
       <w:proofErr w:type="spellEnd"/>
       <w:r>
         <w:rPr>
@@ -12495,6 +12853,15 @@
         </w:rPr>
         <w:t>authority_gerant</w:t>
       </w:r>
+      <w:r>
+        <w:rPr>
+          <w:rFonts w:asciiTheme="minorBidi" w:eastAsia="Times New Roman" w:hAnsiTheme="minorBidi"/>
+          <w:sz w:val="24"/>
+          <w:szCs w:val="24"/>
+          <w:lang w:eastAsia="fr-FR"/>
+        </w:rPr>
+        <w:t>_ar</w:t>
+      </w:r>
       <w:proofErr w:type="spellEnd"/>
       <w:r>
         <w:rPr>
@@ -12559,6 +12926,15 @@
           <w:lang w:eastAsia="fr-FR"/>
         </w:rPr>
         <w:t>Adresse_entreprise</w:t>
+      </w:r>
+      <w:r>
+        <w:rPr>
+          <w:rFonts w:asciiTheme="minorBidi" w:eastAsia="Times New Roman" w:hAnsiTheme="minorBidi"/>
+          <w:sz w:val="24"/>
+          <w:szCs w:val="24"/>
+          <w:lang w:eastAsia="fr-FR"/>
+        </w:rPr>
+        <w:t>_ar</w:t>
       </w:r>
       <w:proofErr w:type="spellEnd"/>
       <w:r>
@@ -13065,6 +13441,7 @@
         </w:rPr>
         <w:t xml:space="preserve"> {</w:t>
       </w:r>
+      <w:proofErr w:type="spellStart"/>
       <w:proofErr w:type="gramEnd"/>
       <w:r>
         <w:rPr>
@@ -13073,7 +13450,26 @@
           <w:szCs w:val="24"/>
           <w:lang w:eastAsia="fr-FR"/>
         </w:rPr>
-        <w:t>Nom} {</w:t>
+        <w:t>Nom</w:t>
+      </w:r>
+      <w:r>
+        <w:rPr>
+          <w:rFonts w:asciiTheme="minorBidi" w:eastAsia="Times New Roman" w:hAnsiTheme="minorBidi"/>
+          <w:sz w:val="24"/>
+          <w:szCs w:val="24"/>
+          <w:lang w:eastAsia="fr-FR"/>
+        </w:rPr>
+        <w:t>_ar</w:t>
+      </w:r>
+      <w:proofErr w:type="spellEnd"/>
+      <w:r>
+        <w:rPr>
+          <w:rFonts w:asciiTheme="minorBidi" w:eastAsia="Times New Roman" w:hAnsiTheme="minorBidi"/>
+          <w:sz w:val="24"/>
+          <w:szCs w:val="24"/>
+          <w:lang w:eastAsia="fr-FR"/>
+        </w:rPr>
+        <w:t>} {</w:t>
       </w:r>
       <w:proofErr w:type="spellStart"/>
       <w:r>
@@ -13085,6 +13481,15 @@
         </w:rPr>
         <w:t>Prenom</w:t>
       </w:r>
+      <w:r>
+        <w:rPr>
+          <w:rFonts w:asciiTheme="minorBidi" w:eastAsia="Times New Roman" w:hAnsiTheme="minorBidi"/>
+          <w:sz w:val="24"/>
+          <w:szCs w:val="24"/>
+          <w:lang w:eastAsia="fr-FR"/>
+        </w:rPr>
+        <w:t>_ar</w:t>
+      </w:r>
       <w:proofErr w:type="spellEnd"/>
       <w:r>
         <w:rPr>
@@ -13150,6 +13555,15 @@
         </w:rPr>
         <w:t>Adresse_entreprise</w:t>
       </w:r>
+      <w:r>
+        <w:rPr>
+          <w:rFonts w:asciiTheme="minorBidi" w:eastAsia="Times New Roman" w:hAnsiTheme="minorBidi"/>
+          <w:sz w:val="24"/>
+          <w:szCs w:val="24"/>
+          <w:lang w:eastAsia="fr-FR"/>
+        </w:rPr>
+        <w:t>_ar</w:t>
+      </w:r>
       <w:proofErr w:type="spellEnd"/>
       <w:r>
         <w:rPr>
@@ -13485,7 +13899,7 @@
           <w:szCs w:val="24"/>
           <w:lang w:eastAsia="fr-FR"/>
         </w:rPr>
-        <w:t>{Nom} {</w:t>
+        <w:t>{</w:t>
       </w:r>
       <w:proofErr w:type="spellStart"/>
       <w:r>
@@ -13495,7 +13909,45 @@
           <w:szCs w:val="24"/>
           <w:lang w:eastAsia="fr-FR"/>
         </w:rPr>
+        <w:t>Nom</w:t>
+      </w:r>
+      <w:r>
+        <w:rPr>
+          <w:rFonts w:asciiTheme="minorBidi" w:eastAsia="Times New Roman" w:hAnsiTheme="minorBidi"/>
+          <w:sz w:val="24"/>
+          <w:szCs w:val="24"/>
+          <w:lang w:eastAsia="fr-FR"/>
+        </w:rPr>
+        <w:t>_ar</w:t>
+      </w:r>
+      <w:proofErr w:type="spellEnd"/>
+      <w:r>
+        <w:rPr>
+          <w:rFonts w:asciiTheme="minorBidi" w:eastAsia="Times New Roman" w:hAnsiTheme="minorBidi"/>
+          <w:sz w:val="24"/>
+          <w:szCs w:val="24"/>
+          <w:lang w:eastAsia="fr-FR"/>
+        </w:rPr>
+        <w:t>} {</w:t>
+      </w:r>
+      <w:proofErr w:type="spellStart"/>
+      <w:r>
+        <w:rPr>
+          <w:rFonts w:asciiTheme="minorBidi" w:eastAsia="Times New Roman" w:hAnsiTheme="minorBidi"/>
+          <w:sz w:val="24"/>
+          <w:szCs w:val="24"/>
+          <w:lang w:eastAsia="fr-FR"/>
+        </w:rPr>
         <w:t>Prenom</w:t>
+      </w:r>
+      <w:r>
+        <w:rPr>
+          <w:rFonts w:asciiTheme="minorBidi" w:eastAsia="Times New Roman" w:hAnsiTheme="minorBidi"/>
+          <w:sz w:val="24"/>
+          <w:szCs w:val="24"/>
+          <w:lang w:eastAsia="fr-FR"/>
+        </w:rPr>
+        <w:t>_ar</w:t>
       </w:r>
       <w:proofErr w:type="spellEnd"/>
       <w:r>
@@ -13602,6 +14054,7 @@
         <w:tab/>
         <w:t>{</w:t>
       </w:r>
+      <w:proofErr w:type="spellStart"/>
       <w:proofErr w:type="gramStart"/>
       <w:r>
         <w:rPr>
@@ -13613,6 +14066,16 @@
         <w:t>place</w:t>
       </w:r>
       <w:proofErr w:type="gramEnd"/>
+      <w:r>
+        <w:rPr>
+          <w:rFonts w:asciiTheme="minorBidi" w:eastAsia="Times New Roman" w:hAnsiTheme="minorBidi"/>
+          <w:sz w:val="24"/>
+          <w:szCs w:val="24"/>
+          <w:lang w:eastAsia="fr-FR"/>
+        </w:rPr>
+        <w:t>_ar</w:t>
+      </w:r>
+      <w:proofErr w:type="spellEnd"/>
       <w:r>
         <w:rPr>
           <w:rFonts w:asciiTheme="minorBidi" w:eastAsia="Times New Roman" w:hAnsiTheme="minorBidi"/>
@@ -14402,6 +14865,14 @@
         </w:rPr>
         <w:t>Adresse_entreprise</w:t>
       </w:r>
+      <w:r>
+        <w:rPr>
+          <w:rFonts w:asciiTheme="majorHAnsi" w:hAnsiTheme="majorHAnsi"/>
+          <w:sz w:val="24"/>
+          <w:szCs w:val="28"/>
+        </w:rPr>
+        <w:t>_ar</w:t>
+      </w:r>
       <w:proofErr w:type="spellEnd"/>
       <w:r>
         <w:rPr>
@@ -14748,6 +15219,13 @@
         </w:rPr>
         <w:t>authority_gerant</w:t>
       </w:r>
+      <w:r>
+        <w:rPr>
+          <w:rFonts w:asciiTheme="majorHAnsi" w:hAnsiTheme="majorHAnsi"/>
+          <w:sz w:val="20"/>
+        </w:rPr>
+        <w:t>_ar</w:t>
+      </w:r>
       <w:proofErr w:type="spellEnd"/>
       <w:r>
         <w:rPr>
@@ -15115,7 +15593,7 @@
           <w:szCs w:val="24"/>
           <w:lang w:eastAsia="fr-FR"/>
         </w:rPr>
-        <w:t>{Nom} {</w:t>
+        <w:t>{</w:t>
       </w:r>
       <w:proofErr w:type="spellStart"/>
       <w:r>
@@ -15125,8 +15603,46 @@
           <w:szCs w:val="24"/>
           <w:lang w:eastAsia="fr-FR"/>
         </w:rPr>
+        <w:t>Nom</w:t>
+      </w:r>
+      <w:r>
+        <w:rPr>
+          <w:rFonts w:asciiTheme="minorBidi" w:eastAsia="Times New Roman" w:hAnsiTheme="minorBidi"/>
+          <w:sz w:val="24"/>
+          <w:szCs w:val="24"/>
+          <w:lang w:eastAsia="fr-FR"/>
+        </w:rPr>
+        <w:t>_ar</w:t>
+      </w:r>
+      <w:proofErr w:type="spellEnd"/>
+      <w:r>
+        <w:rPr>
+          <w:rFonts w:asciiTheme="minorBidi" w:eastAsia="Times New Roman" w:hAnsiTheme="minorBidi"/>
+          <w:sz w:val="24"/>
+          <w:szCs w:val="24"/>
+          <w:lang w:eastAsia="fr-FR"/>
+        </w:rPr>
+        <w:t>} {</w:t>
+      </w:r>
+      <w:proofErr w:type="spellStart"/>
+      <w:r>
+        <w:rPr>
+          <w:rFonts w:asciiTheme="minorBidi" w:eastAsia="Times New Roman" w:hAnsiTheme="minorBidi"/>
+          <w:sz w:val="24"/>
+          <w:szCs w:val="24"/>
+          <w:lang w:eastAsia="fr-FR"/>
+        </w:rPr>
         <w:t>Prenom</w:t>
       </w:r>
+      <w:r>
+        <w:rPr>
+          <w:rFonts w:asciiTheme="minorBidi" w:eastAsia="Times New Roman" w:hAnsiTheme="minorBidi"/>
+          <w:sz w:val="24"/>
+          <w:szCs w:val="24"/>
+          <w:lang w:eastAsia="fr-FR"/>
+        </w:rPr>
+        <w:t>_ar</w:t>
+      </w:r>
       <w:proofErr w:type="spellEnd"/>
       <w:r>
         <w:rPr>
@@ -15196,7 +15712,36 @@
           <w:szCs w:val="24"/>
           <w:lang w:eastAsia="fr-FR"/>
         </w:rPr>
-        <w:t>{place}</w:t>
+        <w:t>{</w:t>
+      </w:r>
+      <w:proofErr w:type="spellStart"/>
+      <w:r>
+        <w:rPr>
+          <w:rFonts w:asciiTheme="minorBidi" w:eastAsia="Times New Roman" w:hAnsiTheme="minorBidi"/>
+          <w:sz w:val="24"/>
+          <w:szCs w:val="24"/>
+          <w:lang w:eastAsia="fr-FR"/>
+        </w:rPr>
+        <w:t>place</w:t>
+      </w:r>
+      <w:r>
+        <w:rPr>
+          <w:rFonts w:asciiTheme="minorBidi" w:eastAsia="Times New Roman" w:hAnsiTheme="minorBidi"/>
+          <w:sz w:val="24"/>
+          <w:szCs w:val="24"/>
+          <w:lang w:eastAsia="fr-FR"/>
+        </w:rPr>
+        <w:t>_ar</w:t>
+      </w:r>
+      <w:proofErr w:type="spellEnd"/>
+      <w:r>
+        <w:rPr>
+          <w:rFonts w:asciiTheme="minorBidi" w:eastAsia="Times New Roman" w:hAnsiTheme="minorBidi"/>
+          <w:sz w:val="24"/>
+          <w:szCs w:val="24"/>
+          <w:lang w:eastAsia="fr-FR"/>
+        </w:rPr>
+        <w:t>}</w:t>
       </w:r>
       <w:r>
         <w:rPr>
@@ -15309,8 +15854,6 @@
           <w:rtl/>
         </w:rPr>
       </w:pPr>
-      <w:bookmarkStart w:id="0" w:name="_GoBack"/>
-      <w:bookmarkEnd w:id="0"/>
     </w:p>
     <w:p>
       <w:pPr>
@@ -15486,7 +16029,7 @@
           <w:szCs w:val="24"/>
           <w:lang w:eastAsia="fr-FR"/>
         </w:rPr>
-        <w:t>{Nom} {</w:t>
+        <w:t>{</w:t>
       </w:r>
       <w:proofErr w:type="spellStart"/>
       <w:r>
@@ -15496,7 +16039,45 @@
           <w:szCs w:val="24"/>
           <w:lang w:eastAsia="fr-FR"/>
         </w:rPr>
+        <w:t>Nom</w:t>
+      </w:r>
+      <w:r>
+        <w:rPr>
+          <w:rFonts w:asciiTheme="minorBidi" w:eastAsia="Times New Roman" w:hAnsiTheme="minorBidi"/>
+          <w:sz w:val="24"/>
+          <w:szCs w:val="24"/>
+          <w:lang w:eastAsia="fr-FR"/>
+        </w:rPr>
+        <w:t>_ar</w:t>
+      </w:r>
+      <w:proofErr w:type="spellEnd"/>
+      <w:r>
+        <w:rPr>
+          <w:rFonts w:asciiTheme="minorBidi" w:eastAsia="Times New Roman" w:hAnsiTheme="minorBidi"/>
+          <w:sz w:val="24"/>
+          <w:szCs w:val="24"/>
+          <w:lang w:eastAsia="fr-FR"/>
+        </w:rPr>
+        <w:t>} {</w:t>
+      </w:r>
+      <w:proofErr w:type="spellStart"/>
+      <w:r>
+        <w:rPr>
+          <w:rFonts w:asciiTheme="minorBidi" w:eastAsia="Times New Roman" w:hAnsiTheme="minorBidi"/>
+          <w:sz w:val="24"/>
+          <w:szCs w:val="24"/>
+          <w:lang w:eastAsia="fr-FR"/>
+        </w:rPr>
         <w:t>Prenom</w:t>
+      </w:r>
+      <w:r>
+        <w:rPr>
+          <w:rFonts w:asciiTheme="minorBidi" w:eastAsia="Times New Roman" w:hAnsiTheme="minorBidi"/>
+          <w:sz w:val="24"/>
+          <w:szCs w:val="24"/>
+          <w:lang w:eastAsia="fr-FR"/>
+        </w:rPr>
+        <w:t>_ar</w:t>
       </w:r>
       <w:proofErr w:type="spellEnd"/>
       <w:r>
@@ -15650,7 +16231,17 @@
           <w:rtl/>
           <w:lang w:eastAsia="fr-FR"/>
         </w:rPr>
-        <w:t xml:space="preserve">، الكائن مقرها </w:t>
+        <w:t>، الكائن مقرها ب</w:t>
+      </w:r>
+      <w:r>
+        <w:rPr>
+          <w:rFonts w:asciiTheme="minorBidi" w:eastAsia="Times New Roman" w:hAnsiTheme="minorBidi" w:hint="cs"/>
+          <w:sz w:val="24"/>
+          <w:szCs w:val="24"/>
+          <w:rtl/>
+          <w:lang w:eastAsia="fr-FR"/>
+        </w:rPr>
+        <w:t xml:space="preserve">ـ </w:t>
       </w:r>
       <w:proofErr w:type="spellStart"/>
       <w:r>
@@ -15661,7 +16252,7 @@
           <w:rtl/>
           <w:lang w:eastAsia="fr-FR"/>
         </w:rPr>
-        <w:t>بشلغوم</w:t>
+        <w:t>شلغوم</w:t>
       </w:r>
       <w:proofErr w:type="spellEnd"/>
       <w:r>
@@ -16326,9 +16917,56 @@
           <w:szCs w:val="24"/>
           <w:lang w:eastAsia="fr-FR"/>
         </w:rPr>
-        <w:t>{Nom} {</w:t>
+        <w:t>{</w:t>
       </w:r>
       <w:proofErr w:type="spellStart"/>
+      <w:r>
+        <w:rPr>
+          <w:rFonts w:asciiTheme="minorBidi" w:eastAsia="Times New Roman" w:hAnsiTheme="minorBidi"/>
+          <w:sz w:val="24"/>
+          <w:szCs w:val="24"/>
+          <w:lang w:eastAsia="fr-FR"/>
+        </w:rPr>
+        <w:t>Nom</w:t>
+      </w:r>
+      <w:r>
+        <w:rPr>
+          <w:rFonts w:asciiTheme="minorBidi" w:eastAsia="Times New Roman" w:hAnsiTheme="minorBidi"/>
+          <w:sz w:val="24"/>
+          <w:szCs w:val="24"/>
+          <w:lang w:eastAsia="fr-FR"/>
+        </w:rPr>
+        <w:t>_ar</w:t>
+      </w:r>
+      <w:proofErr w:type="spellEnd"/>
+      <w:r>
+        <w:rPr>
+          <w:rFonts w:asciiTheme="minorBidi" w:eastAsia="Times New Roman" w:hAnsiTheme="minorBidi"/>
+          <w:sz w:val="24"/>
+          <w:szCs w:val="24"/>
+          <w:lang w:eastAsia="fr-FR"/>
+        </w:rPr>
+        <w:t>} {</w:t>
+      </w:r>
+      <w:proofErr w:type="spellStart"/>
+      <w:r>
+        <w:rPr>
+          <w:rFonts w:asciiTheme="minorBidi" w:eastAsia="Times New Roman" w:hAnsiTheme="minorBidi"/>
+          <w:sz w:val="24"/>
+          <w:szCs w:val="24"/>
+          <w:lang w:eastAsia="fr-FR"/>
+        </w:rPr>
+        <w:t>Prenom</w:t>
+      </w:r>
+      <w:r>
+        <w:rPr>
+          <w:rFonts w:asciiTheme="minorBidi" w:eastAsia="Times New Roman" w:hAnsiTheme="minorBidi"/>
+          <w:sz w:val="24"/>
+          <w:szCs w:val="24"/>
+          <w:lang w:eastAsia="fr-FR"/>
+        </w:rPr>
+        <w:t>_</w:t>
+      </w:r>
       <w:proofErr w:type="gramStart"/>
       <w:r>
         <w:rPr>
@@ -16337,7 +16975,7 @@
           <w:szCs w:val="24"/>
           <w:lang w:eastAsia="fr-FR"/>
         </w:rPr>
-        <w:t>Prenom</w:t>
+        <w:t>ar</w:t>
       </w:r>
       <w:proofErr w:type="spellEnd"/>
       <w:r>
@@ -16543,7 +17181,27 @@
           <w:szCs w:val="24"/>
           <w:lang w:eastAsia="fr-FR"/>
         </w:rPr>
-        <w:t>{place}</w:t>
+        <w:t>{place</w:t>
+      </w:r>
+      <w:r>
+        <w:rPr>
+          <w:rFonts w:asciiTheme="minorBidi" w:eastAsia="Times New Roman" w:hAnsiTheme="minorBidi"/>
+          <w:sz w:val="24"/>
+          <w:szCs w:val="24"/>
+          <w:lang w:eastAsia="fr-FR"/>
+        </w:rPr>
+        <w:t>_ar</w:t>
+      </w:r>
+      <w:bookmarkStart w:id="0" w:name="_GoBack"/>
+      <w:bookmarkEnd w:id="0"/>
+      <w:r>
+        <w:rPr>
+          <w:rFonts w:asciiTheme="minorBidi" w:eastAsia="Times New Roman" w:hAnsiTheme="minorBidi"/>
+          <w:sz w:val="24"/>
+          <w:szCs w:val="24"/>
+          <w:lang w:eastAsia="fr-FR"/>
+        </w:rPr>
+        <w:t>}</w:t>
       </w:r>
       <w:r>
         <w:rPr>

</xml_diff>